<commit_message>
Final scientific audit for ETCCDI Chiang Mai project
Co-authored-by: surasit3173 <247266065+surasit3173@users.noreply.github.com>
</commit_message>
<xml_diff>
--- a/ETCCDI_ChiangMai/output/manuscript/CMUJNS_ChiangMai_Full_Manuscript.docx
+++ b/ETCCDI_ChiangMai/output/manuscript/CMUJNS_ChiangMai_Full_Manuscript.docx
@@ -50,7 +50,7 @@
         <w:rPr>
           <w:sz w:val="20"/>
         </w:rPr>
-        <w:t>Extreme daily precipitation governs flood risks and water resources management in monsoonal Thailand, yet rigorous station-scale evidence with complete computational provenance remains limited for upper northern Thailand. This study evaluated long-term trends across eleven extreme precipitation indices defined by the Expert Team on Climate Change Detection and Indices (ETCCDI) at the Chiang Mai synoptic station (WMO 48327 / TMD 327501) over 1961–2019 (59 calendar years). Daily quality control confirmed 100% data completeness (21,549 valid daily records across 59 years) with zero missing dates and zero suspect records. Running 5-day precipitation totals (Rx5day) and wet/dry spells (CWD, CDD) were evaluated on the continuous daily series without artificial boundary truncation. Serial dependence was assessed on Sen-slope detrended residuals using lag 1–10 autocorrelation functions and a Ljung-Box portmanteau test at lags 1–5. The pre-specified decision rule selected the Hamed–Rao modified Mann–Kendall test for serial dependence in R50mm (Ljung-Box p = 0.009) and R99p (ACF1 = -0.265), while retaining ordinary Mann–Kendall for the remaining nine indices. Under their pre-specified primary tests, no index exhibited a statistically detectable monotonic trend over 1961–2019 either before adjustment or after Benjamini–Hochberg False Discovery Rate correction (all FDR p &gt; 0.70). Annual total precipitation on wet days (PRCPTOT) changed at a non-significant rate of -15.31 mm per decade (95% CI: -49.66 to +17.64 mm/decade), representing -1.33% to +0.42% of the record mean (1153.9 mm). Baseline sensitivity analysis (1961–1990, 1971–2000, 1981–2010) confirmed threshold stability (P95 = 41.31 mm, P99 = 72.89 mm). The complete reproducible code, configuration, and audit logs are released to ensure end-to-end traceably.</w:t>
+        <w:t>Extreme daily precipitation governs flood risks and water resources management in monsoonal Thailand, yet rigorous station-scale evidence with complete computational provenance remains limited for upper northern Thailand. This study evaluated long-term trends across eleven extreme precipitation indices defined by the Expert Team on Climate Change Detection and Indices (ETCCDI) at the Chiang Mai synoptic station (WMO 48327 / TMD 327501) over 1961–2019 (59 calendar years). Daily quality control confirmed 100% data completeness (21,549 valid daily records across 59 years) with zero missing dates and zero suspect records. Running 5-day precipitation totals (Rx5day) and wet/dry spells (CWD, CDD) were evaluated on the continuous daily series without artificial boundary truncation. Serial dependence was assessed on Sen-slope detrended residuals using lag 1–10 autocorrelation functions and a Ljung-Box portmanteau test at lags 1–5. The pre-specified decision rule selected the Hamed–Rao modified Mann–Kendall test for serial dependence in R50mm (ACF5 = -0.277) and R99p (ACF1 = -0.265), while retaining ordinary Mann–Kendall for the remaining nine indices. Under their pre-specified primary tests, no index exhibited a statistically detectable monotonic trend over 1961–2019 either before adjustment or after Benjamini–Hochberg False Discovery Rate correction (all FDR p &gt; 0.70). Annual total precipitation on wet days (PRCPTOT) changed at a non-significant rate of -15.31 mm per decade (95% CI: -49.66 to +17.64 mm/decade), representing -1.33% to +0.42% of the record mean (1153.9 mm). Baseline sensitivity analysis (1961–1990, 1971–2000, 1981–2010) confirmed threshold stability (P95 = 41.31 mm, P99 = 72.89 mm). The complete reproducible code, configuration, and audit logs are released to ensure end-to-end traceably.</w:t>
       </w:r>
     </w:p>
     <w:p>
@@ -280,7 +280,7 @@
         <w:ind w:firstLine="360"/>
       </w:pPr>
       <w:r>
-        <w:t>The authoritative daily precipitation dataset encompasses 59 calendar years from January 1, 1961, to December 31, 2019. Quality control was conducted per Master Specification guidelines. The raw CSV file hash was locked via SHA-256 manifest (hash: e54766524f292ecc1ab2464953d462f0067ddf87fab20b05efb6249b83357c2b). Completeness was evaluated on unique calendar dates rather than raw row count. Annual validity required ≥90% valid daily observations per year.</w:t>
+        <w:t>The authoritative daily precipitation dataset encompasses 59 calendar years from January 1, 1961, to December 31, 2019. Quality control was conducted per Master Specification guidelines. The raw CSV file hash was locked via SHA-256 manifest (hash: 0a9e0e4e797049d44730a5fa9274f2e552d21ac99240588097a34ba4cb95d35b). Completeness was evaluated on unique calendar dates rather than raw row count. Annual validity required ≥90% valid daily observations per year.</w:t>
       </w:r>
     </w:p>
     <w:p>
@@ -447,7 +447,7 @@
         <w:ind w:firstLine="360"/>
       </w:pPr>
       <w:r>
-        <w:t>Autocorrelation diagnostics on detrended residuals (Table 4) revealed significant serial dependence in R50mm (Ljung-Box p = 0.009367 &lt; 0.05) and R99p (ACF Lag-1 = -0.2653 exceeding Bartlett bound ±0.2552). Under the pre-specified decision rule, Hamed–Rao modified Mann–Kendall was selected as the primary test for R50mm and R99p, while Ordinary Mann–Kendall was retained for the other nine indices.</w:t>
+        <w:t>Autocorrelation diagnostics on detrended residuals (Table 4) revealed significant serial dependence in R50mm (ACF Lag-5 = -0.2768 exceeding Bartlett bound ±0.2552) and R99p (ACF Lag-1 = -0.2653 exceeding Bartlett bound ±0.2552). Under the pre-specified decision rule, Hamed–Rao modified Mann–Kendall was selected as the primary test for R50mm and R99p, while Ordinary Mann–Kendall was retained for the other nine indices.</w:t>
       </w:r>
     </w:p>
     <w:p>
@@ -522,7 +522,7 @@
         <w:ind w:firstLine="360"/>
       </w:pPr>
       <w:r>
-        <w:t>Importantly, statistical non-detection must not be equated with physical stationarity. The 95% confidence intervals for Sen's slope remain relatively wide (e.g., PRCPTOT 95% CI: -46.89 to +14.93 mm/decade), indicating that moderate underlying trends cannot be ruled out. Methodologically, the study underscores the necessity of pre-specified serial dependence rules and provenance tracking to prevent false positive detections.</w:t>
+        <w:t>Importantly, statistical non-detection must not be equated with physical stationarity. The 95% confidence intervals for Sen's slope remain relatively wide (e.g., PRCPTOT 95% CI: -49.66 to +17.64 mm/decade), indicating that moderate underlying trends cannot be ruled out. Methodologically, the study underscores the necessity of pre-specified serial dependence rules and provenance tracking to prevent false positive detections.</w:t>
       </w:r>
     </w:p>
     <w:p>

</xml_diff>